<commit_message>
Tidy write-up cover page and fix title typo
</commit_message>
<xml_diff>
--- a/docs/physics_research.docx
+++ b/docs/physics_research.docx
@@ -87,7 +87,7 @@
           <w:sz w:val="40"/>
           <w:szCs w:val="40"/>
         </w:rPr>
-        <w:t>A Comparative Analysis of Physics-Informed Neural Networks and Tradition Numerical Methods for Modelling Projectile Motion under Air Resistance</w:t>
+        <w:t>A Comparative Analysis of Physics-Informed Neural Networks and Traditional Numerical Methods for Modelling Projectile Motion under Air Resistance</w:t>
       </w:r>
     </w:p>
     <w:p>
@@ -149,14 +149,12 @@
           <w:sz w:val="36"/>
           <w:szCs w:val="36"/>
         </w:rPr>
-        <w:t xml:space="preserve">Word Count: </w:t>
       </w:r>
       <w:r>
         <w:rPr>
           <w:sz w:val="36"/>
           <w:szCs w:val="36"/>
         </w:rPr>
-        <w:t>3988</w:t>
       </w:r>
     </w:p>
     <w:p>
@@ -204,7 +202,6 @@
           <w:sz w:val="28"/>
           <w:szCs w:val="28"/>
         </w:rPr>
-        <w:t>HL Physics</w:t>
       </w:r>
     </w:p>
     <w:p>

</xml_diff>